<commit_message>
ajout cdc et readme
</commit_message>
<xml_diff>
--- a/Docs/Cahier des charges site.docx
+++ b/Docs/Cahier des charges site.docx
@@ -180,7 +180,13 @@
         <w:rPr>
           <w:color w:val="888888"/>
         </w:rPr>
-        <w:t>Mars 2025</w:t>
+        <w:t>Mars 202</w:t>
+      </w:r>
+      <w:r>
+        <w:rPr>
+          <w:color w:val="888888"/>
+        </w:rPr>
+        <w:t>6</w:t>
       </w:r>
     </w:p>
     <w:p>
@@ -7606,7 +7612,7 @@
           <w:noProof/>
         </w:rPr>
         <w:drawing>
-          <wp:inline distT="0" distB="0" distL="0" distR="0" wp14:anchorId="0C25BF60" wp14:editId="35CF5910">
+          <wp:inline distT="0" distB="0" distL="0" distR="0" wp14:anchorId="0C25BF60" wp14:editId="3FD3624C">
             <wp:extent cx="5759450" cy="3606800"/>
             <wp:effectExtent l="0" t="0" r="0" b="0"/>
             <wp:docPr id="940373986" name="Image 1"/>

</xml_diff>